<commit_message>
README: integrantes, descripción del sistema, módulos JS y endpoints; acta actualizada
Co-Authored-By: Claude Opus 5.5 <noreply@anthropic.com>
</commit_message>
<xml_diff>
--- a/docs/Acta_Constitucion_Grupo1.docx
+++ b/docs/Acta_Constitucion_Grupo1.docx
@@ -100,12 +100,6 @@
         <w:gridCol w:w="6800"/>
       </w:tblGrid>
       <w:tr>
-        <w:tblPrEx>
-          <w:tblCellMar>
-            <w:top w:w="0" w:type="dxa"/>
-            <w:bottom w:w="0" w:type="dxa"/>
-          </w:tblCellMar>
-        </w:tblPrEx>
         <w:tc>
           <w:tcPr>
             <w:tcW w:w="2400" w:type="dxa"/>
@@ -159,12 +153,6 @@
         </w:tc>
       </w:tr>
       <w:tr>
-        <w:tblPrEx>
-          <w:tblCellMar>
-            <w:top w:w="0" w:type="dxa"/>
-            <w:bottom w:w="0" w:type="dxa"/>
-          </w:tblCellMar>
-        </w:tblPrEx>
         <w:tc>
           <w:tcPr>
             <w:tcW w:w="2400" w:type="dxa"/>
@@ -218,12 +206,6 @@
         </w:tc>
       </w:tr>
       <w:tr>
-        <w:tblPrEx>
-          <w:tblCellMar>
-            <w:top w:w="0" w:type="dxa"/>
-            <w:bottom w:w="0" w:type="dxa"/>
-          </w:tblCellMar>
-        </w:tblPrEx>
         <w:tc>
           <w:tcPr>
             <w:tcW w:w="2400" w:type="dxa"/>
@@ -277,12 +259,6 @@
         </w:tc>
       </w:tr>
       <w:tr>
-        <w:tblPrEx>
-          <w:tblCellMar>
-            <w:top w:w="0" w:type="dxa"/>
-            <w:bottom w:w="0" w:type="dxa"/>
-          </w:tblCellMar>
-        </w:tblPrEx>
         <w:tc>
           <w:tcPr>
             <w:tcW w:w="2400" w:type="dxa"/>
@@ -336,12 +312,6 @@
         </w:tc>
       </w:tr>
       <w:tr>
-        <w:tblPrEx>
-          <w:tblCellMar>
-            <w:top w:w="0" w:type="dxa"/>
-            <w:bottom w:w="0" w:type="dxa"/>
-          </w:tblCellMar>
-        </w:tblPrEx>
         <w:tc>
           <w:tcPr>
             <w:tcW w:w="2400" w:type="dxa"/>
@@ -395,12 +365,6 @@
         </w:tc>
       </w:tr>
       <w:tr>
-        <w:tblPrEx>
-          <w:tblCellMar>
-            <w:top w:w="0" w:type="dxa"/>
-            <w:bottom w:w="0" w:type="dxa"/>
-          </w:tblCellMar>
-        </w:tblPrEx>
         <w:tc>
           <w:tcPr>
             <w:tcW w:w="2400" w:type="dxa"/>
@@ -454,12 +418,6 @@
         </w:tc>
       </w:tr>
       <w:tr>
-        <w:tblPrEx>
-          <w:tblCellMar>
-            <w:top w:w="0" w:type="dxa"/>
-            <w:bottom w:w="0" w:type="dxa"/>
-          </w:tblCellMar>
-        </w:tblPrEx>
         <w:tc>
           <w:tcPr>
             <w:tcW w:w="2400" w:type="dxa"/>
@@ -547,26 +505,20 @@
         <w:tblLook w:val="04A0" w:firstRow="1" w:lastRow="0" w:firstColumn="1" w:lastColumn="0" w:noHBand="0" w:noVBand="1"/>
       </w:tblPr>
       <w:tblGrid>
-        <w:gridCol w:w="2405"/>
-        <w:gridCol w:w="1385"/>
-        <w:gridCol w:w="3345"/>
-        <w:gridCol w:w="1707"/>
-        <w:gridCol w:w="858"/>
+        <w:gridCol w:w="2486"/>
+        <w:gridCol w:w="1237"/>
+        <w:gridCol w:w="3434"/>
+        <w:gridCol w:w="1690"/>
+        <w:gridCol w:w="853"/>
       </w:tblGrid>
       <w:tr>
-        <w:tblPrEx>
-          <w:tblCellMar>
-            <w:top w:w="0" w:type="dxa"/>
-            <w:bottom w:w="0" w:type="dxa"/>
-          </w:tblCellMar>
-        </w:tblPrEx>
         <w:trPr>
           <w:trHeight w:val="195"/>
           <w:tblHeader/>
         </w:trPr>
         <w:tc>
           <w:tcPr>
-            <w:tcW w:w="2405" w:type="dxa"/>
+            <w:tcW w:w="2547" w:type="dxa"/>
             <w:tcBorders>
               <w:top w:val="single" w:sz="4" w:space="0" w:color="999999"/>
               <w:left w:val="single" w:sz="4" w:space="0" w:color="999999"/>
@@ -598,7 +550,7 @@
         </w:tc>
         <w:tc>
           <w:tcPr>
-            <w:tcW w:w="1385" w:type="dxa"/>
+            <w:tcW w:w="1243" w:type="dxa"/>
             <w:tcBorders>
               <w:top w:val="single" w:sz="4" w:space="0" w:color="999999"/>
               <w:left w:val="single" w:sz="4" w:space="0" w:color="999999"/>
@@ -726,15 +678,9 @@
         </w:tc>
       </w:tr>
       <w:tr>
-        <w:tblPrEx>
-          <w:tblCellMar>
-            <w:top w:w="0" w:type="dxa"/>
-            <w:bottom w:w="0" w:type="dxa"/>
-          </w:tblCellMar>
-        </w:tblPrEx>
-        <w:tc>
-          <w:tcPr>
-            <w:tcW w:w="2405" w:type="dxa"/>
+        <w:tc>
+          <w:tcPr>
+            <w:tcW w:w="2547" w:type="dxa"/>
             <w:tcBorders>
               <w:top w:val="single" w:sz="4" w:space="0" w:color="999999"/>
               <w:left w:val="single" w:sz="4" w:space="0" w:color="999999"/>
@@ -757,7 +703,7 @@
         </w:tc>
         <w:tc>
           <w:tcPr>
-            <w:tcW w:w="1385" w:type="dxa"/>
+            <w:tcW w:w="1243" w:type="dxa"/>
             <w:tcBorders>
               <w:top w:val="single" w:sz="4" w:space="0" w:color="999999"/>
               <w:left w:val="single" w:sz="4" w:space="0" w:color="999999"/>
@@ -797,7 +743,13 @@
           </w:tcPr>
           <w:p>
             <w:r>
-              <w:t>christopher.blanco.solano@est.un.ac.cr</w:t>
+              <w:t>christopher.blanco.solano@est.un</w:t>
+            </w:r>
+            <w:r>
+              <w:t>a</w:t>
+            </w:r>
+            <w:r>
+              <w:t>.ac.cr</w:t>
             </w:r>
           </w:p>
         </w:tc>
@@ -820,7 +772,7 @@
           </w:tcPr>
           <w:p>
             <w:r>
-              <w:t>(completar)</w:t>
+              <w:t>Desarrollador</w:t>
             </w:r>
           </w:p>
         </w:tc>
@@ -844,62 +796,59 @@
           <w:p>
             <w:pPr>
               <w:rPr>
-                <w:rFonts w:ascii="Apple Chancery" w:hAnsi="Apple Chancery" w:cs="Apple Chancery" w:hint="cs"/>
+                <w:rFonts w:ascii="Apple Chancery" w:hAnsi="Apple Chancery" w:cs="Apple Chancery"/>
               </w:rPr>
             </w:pPr>
           </w:p>
         </w:tc>
       </w:tr>
       <w:tr>
-        <w:tblPrEx>
-          <w:tblCellMar>
-            <w:top w:w="0" w:type="dxa"/>
-            <w:bottom w:w="0" w:type="dxa"/>
-          </w:tblCellMar>
-        </w:tblPrEx>
-        <w:tc>
-          <w:tcPr>
-            <w:tcW w:w="2405" w:type="dxa"/>
-            <w:tcBorders>
-              <w:top w:val="single" w:sz="4" w:space="0" w:color="999999"/>
-              <w:left w:val="single" w:sz="4" w:space="0" w:color="999999"/>
-              <w:bottom w:val="single" w:sz="4" w:space="0" w:color="999999"/>
-              <w:right w:val="single" w:sz="4" w:space="0" w:color="999999"/>
-            </w:tcBorders>
-            <w:tcMar>
-              <w:top w:w="120" w:type="dxa"/>
-              <w:left w:w="100" w:type="dxa"/>
-              <w:bottom w:w="120" w:type="dxa"/>
-              <w:right w:w="100" w:type="dxa"/>
-            </w:tcMar>
-            <w:vAlign w:val="center"/>
-          </w:tcPr>
-          <w:p>
-            <w:r>
-              <w:t>(completar)</w:t>
-            </w:r>
-          </w:p>
-        </w:tc>
-        <w:tc>
-          <w:tcPr>
-            <w:tcW w:w="1385" w:type="dxa"/>
-            <w:tcBorders>
-              <w:top w:val="single" w:sz="4" w:space="0" w:color="999999"/>
-              <w:left w:val="single" w:sz="4" w:space="0" w:color="999999"/>
-              <w:bottom w:val="single" w:sz="4" w:space="0" w:color="999999"/>
-              <w:right w:val="single" w:sz="4" w:space="0" w:color="999999"/>
-            </w:tcBorders>
-            <w:tcMar>
-              <w:top w:w="120" w:type="dxa"/>
-              <w:left w:w="100" w:type="dxa"/>
-              <w:bottom w:w="120" w:type="dxa"/>
-              <w:right w:w="100" w:type="dxa"/>
-            </w:tcMar>
-            <w:vAlign w:val="center"/>
-          </w:tcPr>
-          <w:p>
-            <w:r>
-              <w:t>(completar)</w:t>
+        <w:tc>
+          <w:tcPr>
+            <w:tcW w:w="2547" w:type="dxa"/>
+            <w:tcBorders>
+              <w:top w:val="single" w:sz="4" w:space="0" w:color="999999"/>
+              <w:left w:val="single" w:sz="4" w:space="0" w:color="999999"/>
+              <w:bottom w:val="single" w:sz="4" w:space="0" w:color="999999"/>
+              <w:right w:val="single" w:sz="4" w:space="0" w:color="999999"/>
+            </w:tcBorders>
+            <w:tcMar>
+              <w:top w:w="120" w:type="dxa"/>
+              <w:left w:w="100" w:type="dxa"/>
+              <w:bottom w:w="120" w:type="dxa"/>
+              <w:right w:w="100" w:type="dxa"/>
+            </w:tcMar>
+            <w:vAlign w:val="center"/>
+          </w:tcPr>
+          <w:p>
+            <w:r>
+              <w:t>Alexander Dittel Escoba</w:t>
+            </w:r>
+            <w:r>
+              <w:t>r</w:t>
+            </w:r>
+          </w:p>
+        </w:tc>
+        <w:tc>
+          <w:tcPr>
+            <w:tcW w:w="1243" w:type="dxa"/>
+            <w:tcBorders>
+              <w:top w:val="single" w:sz="4" w:space="0" w:color="999999"/>
+              <w:left w:val="single" w:sz="4" w:space="0" w:color="999999"/>
+              <w:bottom w:val="single" w:sz="4" w:space="0" w:color="999999"/>
+              <w:right w:val="single" w:sz="4" w:space="0" w:color="999999"/>
+            </w:tcBorders>
+            <w:tcMar>
+              <w:top w:w="120" w:type="dxa"/>
+              <w:left w:w="100" w:type="dxa"/>
+              <w:bottom w:w="120" w:type="dxa"/>
+              <w:right w:w="100" w:type="dxa"/>
+            </w:tcMar>
+            <w:vAlign w:val="center"/>
+          </w:tcPr>
+          <w:p>
+            <w:r>
+              <w:t>117170394</w:t>
             </w:r>
           </w:p>
         </w:tc>
@@ -922,7 +871,7 @@
           </w:tcPr>
           <w:p>
             <w:r>
-              <w:t>(completar)</w:t>
+              <w:t>alexander.dittel.escobar@est.una.ac.cr</w:t>
             </w:r>
           </w:p>
         </w:tc>
@@ -945,7 +894,7 @@
           </w:tcPr>
           <w:p>
             <w:r>
-              <w:t>(completar)</w:t>
+              <w:t>Desarrollador</w:t>
             </w:r>
           </w:p>
         </w:tc>
@@ -970,55 +919,52 @@
         </w:tc>
       </w:tr>
       <w:tr>
-        <w:tblPrEx>
-          <w:tblCellMar>
-            <w:top w:w="0" w:type="dxa"/>
-            <w:bottom w:w="0" w:type="dxa"/>
-          </w:tblCellMar>
-        </w:tblPrEx>
-        <w:tc>
-          <w:tcPr>
-            <w:tcW w:w="2405" w:type="dxa"/>
-            <w:tcBorders>
-              <w:top w:val="single" w:sz="4" w:space="0" w:color="999999"/>
-              <w:left w:val="single" w:sz="4" w:space="0" w:color="999999"/>
-              <w:bottom w:val="single" w:sz="4" w:space="0" w:color="999999"/>
-              <w:right w:val="single" w:sz="4" w:space="0" w:color="999999"/>
-            </w:tcBorders>
-            <w:tcMar>
-              <w:top w:w="120" w:type="dxa"/>
-              <w:left w:w="100" w:type="dxa"/>
-              <w:bottom w:w="120" w:type="dxa"/>
-              <w:right w:w="100" w:type="dxa"/>
-            </w:tcMar>
-            <w:vAlign w:val="center"/>
-          </w:tcPr>
-          <w:p>
-            <w:r>
-              <w:t>(completar)</w:t>
-            </w:r>
-          </w:p>
-        </w:tc>
-        <w:tc>
-          <w:tcPr>
-            <w:tcW w:w="1385" w:type="dxa"/>
-            <w:tcBorders>
-              <w:top w:val="single" w:sz="4" w:space="0" w:color="999999"/>
-              <w:left w:val="single" w:sz="4" w:space="0" w:color="999999"/>
-              <w:bottom w:val="single" w:sz="4" w:space="0" w:color="999999"/>
-              <w:right w:val="single" w:sz="4" w:space="0" w:color="999999"/>
-            </w:tcBorders>
-            <w:tcMar>
-              <w:top w:w="120" w:type="dxa"/>
-              <w:left w:w="100" w:type="dxa"/>
-              <w:bottom w:w="120" w:type="dxa"/>
-              <w:right w:w="100" w:type="dxa"/>
-            </w:tcMar>
-            <w:vAlign w:val="center"/>
-          </w:tcPr>
-          <w:p>
-            <w:r>
-              <w:t>(completar)</w:t>
+        <w:tc>
+          <w:tcPr>
+            <w:tcW w:w="2547" w:type="dxa"/>
+            <w:tcBorders>
+              <w:top w:val="single" w:sz="4" w:space="0" w:color="999999"/>
+              <w:left w:val="single" w:sz="4" w:space="0" w:color="999999"/>
+              <w:bottom w:val="single" w:sz="4" w:space="0" w:color="999999"/>
+              <w:right w:val="single" w:sz="4" w:space="0" w:color="999999"/>
+            </w:tcBorders>
+            <w:tcMar>
+              <w:top w:w="120" w:type="dxa"/>
+              <w:left w:w="100" w:type="dxa"/>
+              <w:bottom w:w="120" w:type="dxa"/>
+              <w:right w:w="100" w:type="dxa"/>
+            </w:tcMar>
+            <w:vAlign w:val="center"/>
+          </w:tcPr>
+          <w:p>
+            <w:r>
+              <w:t>A</w:t>
+            </w:r>
+            <w:r>
+              <w:t>slehy Claret Aguilar Perez</w:t>
+            </w:r>
+          </w:p>
+        </w:tc>
+        <w:tc>
+          <w:tcPr>
+            <w:tcW w:w="1243" w:type="dxa"/>
+            <w:tcBorders>
+              <w:top w:val="single" w:sz="4" w:space="0" w:color="999999"/>
+              <w:left w:val="single" w:sz="4" w:space="0" w:color="999999"/>
+              <w:bottom w:val="single" w:sz="4" w:space="0" w:color="999999"/>
+              <w:right w:val="single" w:sz="4" w:space="0" w:color="999999"/>
+            </w:tcBorders>
+            <w:tcMar>
+              <w:top w:w="120" w:type="dxa"/>
+              <w:left w:w="100" w:type="dxa"/>
+              <w:bottom w:w="120" w:type="dxa"/>
+              <w:right w:w="100" w:type="dxa"/>
+            </w:tcMar>
+            <w:vAlign w:val="center"/>
+          </w:tcPr>
+          <w:p>
+            <w:r>
+              <w:t>116340775</w:t>
             </w:r>
           </w:p>
         </w:tc>
@@ -1041,7 +987,10 @@
           </w:tcPr>
           <w:p>
             <w:r>
-              <w:t>(completar)</w:t>
+              <w:t>a</w:t>
+            </w:r>
+            <w:r>
+              <w:t>slehy.aguilar.perez@est.una.ac.cr</w:t>
             </w:r>
           </w:p>
         </w:tc>
@@ -1064,7 +1013,7 @@
           </w:tcPr>
           <w:p>
             <w:r>
-              <w:t>(completar)</w:t>
+              <w:t>Desarrollador</w:t>
             </w:r>
           </w:p>
         </w:tc>
@@ -1140,12 +1089,6 @@
         <w:gridCol w:w="6500"/>
       </w:tblGrid>
       <w:tr>
-        <w:tblPrEx>
-          <w:tblCellMar>
-            <w:top w:w="0" w:type="dxa"/>
-            <w:bottom w:w="0" w:type="dxa"/>
-          </w:tblCellMar>
-        </w:tblPrEx>
         <w:trPr>
           <w:tblHeader/>
         </w:trPr>
@@ -1247,12 +1190,6 @@
         </w:tc>
       </w:tr>
       <w:tr>
-        <w:tblPrEx>
-          <w:tblCellMar>
-            <w:top w:w="0" w:type="dxa"/>
-            <w:bottom w:w="0" w:type="dxa"/>
-          </w:tblCellMar>
-        </w:tblPrEx>
         <w:tc>
           <w:tcPr>
             <w:tcW w:w="900" w:type="dxa"/>
@@ -1330,12 +1267,6 @@
         </w:tc>
       </w:tr>
       <w:tr>
-        <w:tblPrEx>
-          <w:tblCellMar>
-            <w:top w:w="0" w:type="dxa"/>
-            <w:bottom w:w="0" w:type="dxa"/>
-          </w:tblCellMar>
-        </w:tblPrEx>
         <w:tc>
           <w:tcPr>
             <w:tcW w:w="900" w:type="dxa"/>
@@ -1413,12 +1344,6 @@
         </w:tc>
       </w:tr>
       <w:tr>
-        <w:tblPrEx>
-          <w:tblCellMar>
-            <w:top w:w="0" w:type="dxa"/>
-            <w:bottom w:w="0" w:type="dxa"/>
-          </w:tblCellMar>
-        </w:tblPrEx>
         <w:tc>
           <w:tcPr>
             <w:tcW w:w="900" w:type="dxa"/>
@@ -1496,12 +1421,6 @@
         </w:tc>
       </w:tr>
       <w:tr>
-        <w:tblPrEx>
-          <w:tblCellMar>
-            <w:top w:w="0" w:type="dxa"/>
-            <w:bottom w:w="0" w:type="dxa"/>
-          </w:tblCellMar>
-        </w:tblPrEx>
         <w:tc>
           <w:tcPr>
             <w:tcW w:w="900" w:type="dxa"/>
@@ -1579,12 +1498,6 @@
         </w:tc>
       </w:tr>
       <w:tr>
-        <w:tblPrEx>
-          <w:tblCellMar>
-            <w:top w:w="0" w:type="dxa"/>
-            <w:bottom w:w="0" w:type="dxa"/>
-          </w:tblCellMar>
-        </w:tblPrEx>
         <w:tc>
           <w:tcPr>
             <w:tcW w:w="900" w:type="dxa"/>
@@ -1663,12 +1576,6 @@
         </w:tc>
       </w:tr>
       <w:tr>
-        <w:tblPrEx>
-          <w:tblCellMar>
-            <w:top w:w="0" w:type="dxa"/>
-            <w:bottom w:w="0" w:type="dxa"/>
-          </w:tblCellMar>
-        </w:tblPrEx>
         <w:tc>
           <w:tcPr>
             <w:tcW w:w="900" w:type="dxa"/>
@@ -1853,6 +1760,10 @@
     <w:p>
       <w:pPr>
         <w:spacing w:after="160"/>
+        <w:rPr>
+          <w:sz w:val="22"/>
+          <w:szCs w:val="22"/>
+        </w:rPr>
       </w:pPr>
       <w:r>
         <w:rPr>
@@ -1862,172 +1773,274 @@
         <w:t>Al firmar la presente acta, cada integrante confirma haber leído y aceptado los términos descritos en este documento.</w:t>
       </w:r>
     </w:p>
-    <w:tbl>
-      <w:tblPr>
-        <w:tblW w:w="9700" w:type="dxa"/>
-        <w:tblBorders>
-          <w:top w:val="single" w:sz="4" w:space="0" w:color="auto"/>
-          <w:left w:val="single" w:sz="4" w:space="0" w:color="auto"/>
-          <w:bottom w:val="single" w:sz="4" w:space="0" w:color="auto"/>
-          <w:right w:val="single" w:sz="4" w:space="0" w:color="auto"/>
-          <w:insideH w:val="single" w:sz="4" w:space="0" w:color="auto"/>
-          <w:insideV w:val="single" w:sz="4" w:space="0" w:color="auto"/>
-        </w:tblBorders>
-        <w:tblCellMar>
-          <w:left w:w="10" w:type="dxa"/>
-          <w:right w:w="10" w:type="dxa"/>
-        </w:tblCellMar>
-        <w:tblLook w:val="04A0" w:firstRow="1" w:lastRow="0" w:firstColumn="1" w:lastColumn="0" w:noHBand="0" w:noVBand="1"/>
-      </w:tblPr>
-      <w:tblGrid>
-        <w:gridCol w:w="4300"/>
-        <w:gridCol w:w="5400"/>
-      </w:tblGrid>
-      <w:tr>
-        <w:tblPrEx>
-          <w:tblCellMar>
-            <w:top w:w="0" w:type="dxa"/>
-            <w:bottom w:w="0" w:type="dxa"/>
-          </w:tblCellMar>
-        </w:tblPrEx>
-        <w:tc>
-          <w:tcPr>
-            <w:tcW w:w="4300" w:type="dxa"/>
-            <w:tcBorders>
-              <w:bottom w:val="single" w:sz="4" w:space="0" w:color="999999"/>
-            </w:tcBorders>
-            <w:tcMar>
-              <w:top w:w="300" w:type="dxa"/>
-              <w:left w:w="100" w:type="dxa"/>
-              <w:bottom w:w="100" w:type="dxa"/>
-              <w:right w:w="100" w:type="dxa"/>
-            </w:tcMar>
-          </w:tcPr>
-          <w:p>
-            <w:r>
-              <w:t>Christopher Blanco Solano</w:t>
-            </w:r>
-          </w:p>
-        </w:tc>
-        <w:tc>
-          <w:tcPr>
-            <w:tcW w:w="5400" w:type="dxa"/>
-            <w:tcBorders>
-              <w:bottom w:val="single" w:sz="4" w:space="0" w:color="999999"/>
-            </w:tcBorders>
-            <w:tcMar>
-              <w:top w:w="300" w:type="dxa"/>
-              <w:left w:w="100" w:type="dxa"/>
-              <w:bottom w:w="100" w:type="dxa"/>
-              <w:right w:w="100" w:type="dxa"/>
-            </w:tcMar>
-          </w:tcPr>
-          <w:p>
-            <w:r>
-              <w:t>Firma: ______________________________</w:t>
-            </w:r>
-          </w:p>
-        </w:tc>
-      </w:tr>
-      <w:tr>
-        <w:tblPrEx>
-          <w:tblCellMar>
-            <w:top w:w="0" w:type="dxa"/>
-            <w:bottom w:w="0" w:type="dxa"/>
-          </w:tblCellMar>
-        </w:tblPrEx>
-        <w:tc>
-          <w:tcPr>
-            <w:tcW w:w="4300" w:type="dxa"/>
-            <w:tcBorders>
-              <w:bottom w:val="single" w:sz="4" w:space="0" w:color="999999"/>
-            </w:tcBorders>
-            <w:tcMar>
-              <w:top w:w="300" w:type="dxa"/>
-              <w:left w:w="100" w:type="dxa"/>
-              <w:bottom w:w="100" w:type="dxa"/>
-              <w:right w:w="100" w:type="dxa"/>
-            </w:tcMar>
-          </w:tcPr>
-          <w:p>
-            <w:r>
-              <w:t>(nombre)</w:t>
-            </w:r>
-          </w:p>
-        </w:tc>
-        <w:tc>
-          <w:tcPr>
-            <w:tcW w:w="5400" w:type="dxa"/>
-            <w:tcBorders>
-              <w:bottom w:val="single" w:sz="4" w:space="0" w:color="999999"/>
-            </w:tcBorders>
-            <w:tcMar>
-              <w:top w:w="300" w:type="dxa"/>
-              <w:left w:w="100" w:type="dxa"/>
-              <w:bottom w:w="100" w:type="dxa"/>
-              <w:right w:w="100" w:type="dxa"/>
-            </w:tcMar>
-          </w:tcPr>
-          <w:p>
-            <w:r>
-              <w:t>Firma: ______________________________</w:t>
-            </w:r>
-          </w:p>
-        </w:tc>
-      </w:tr>
-      <w:tr>
-        <w:tblPrEx>
-          <w:tblCellMar>
-            <w:top w:w="0" w:type="dxa"/>
-            <w:bottom w:w="0" w:type="dxa"/>
-          </w:tblCellMar>
-        </w:tblPrEx>
-        <w:tc>
-          <w:tcPr>
-            <w:tcW w:w="4300" w:type="dxa"/>
-            <w:tcBorders>
-              <w:bottom w:val="single" w:sz="4" w:space="0" w:color="999999"/>
-            </w:tcBorders>
-            <w:tcMar>
-              <w:top w:w="300" w:type="dxa"/>
-              <w:left w:w="100" w:type="dxa"/>
-              <w:bottom w:w="100" w:type="dxa"/>
-              <w:right w:w="100" w:type="dxa"/>
-            </w:tcMar>
-          </w:tcPr>
-          <w:p>
-            <w:r>
-              <w:t>(nombre)</w:t>
-            </w:r>
-          </w:p>
-        </w:tc>
-        <w:tc>
-          <w:tcPr>
-            <w:tcW w:w="5400" w:type="dxa"/>
-            <w:tcBorders>
-              <w:bottom w:val="single" w:sz="4" w:space="0" w:color="999999"/>
-            </w:tcBorders>
-            <w:tcMar>
-              <w:top w:w="300" w:type="dxa"/>
-              <w:left w:w="100" w:type="dxa"/>
-              <w:bottom w:w="100" w:type="dxa"/>
-              <w:right w:w="100" w:type="dxa"/>
-            </w:tcMar>
-          </w:tcPr>
-          <w:p>
-            <w:r>
-              <w:t>Firma: ______________________________</w:t>
-            </w:r>
-          </w:p>
-        </w:tc>
-      </w:tr>
-    </w:tbl>
     <w:p>
       <w:pPr>
+        <w:spacing w:after="160"/>
+        <w:rPr>
+          <w:sz w:val="22"/>
+          <w:szCs w:val="22"/>
+        </w:rPr>
+      </w:pPr>
+    </w:p>
+    <w:p>
+      <w:pPr>
+        <w:pStyle w:val="ListParagraph"/>
+        <w:numPr>
+          <w:ilvl w:val="0"/>
+          <w:numId w:val="2"/>
+        </w:numPr>
+        <w:spacing w:after="160"/>
+      </w:pPr>
+      <w:r>
+        <w:t>Christopher Blanco Solano</w:t>
+      </w:r>
+      <w:r>
+        <w:br/>
+        <w:t>Firma:</w:t>
+      </w:r>
+      <w:r>
+        <w:rPr>
+          <w:noProof/>
+        </w:rPr>
+        <w:t xml:space="preserve"> </w:t>
+      </w:r>
+    </w:p>
+    <w:p>
+      <w:pPr>
+        <w:spacing w:after="160"/>
+      </w:pPr>
+    </w:p>
+    <w:p>
+      <w:pPr>
+        <w:pStyle w:val="ListParagraph"/>
+        <w:spacing w:after="160"/>
+        <w:ind w:left="720"/>
+      </w:pPr>
+      <w:r>
+        <w:rPr>
+          <w:noProof/>
+        </w:rPr>
+        <w:drawing>
+          <wp:inline distT="0" distB="0" distL="0" distR="0" wp14:anchorId="033868A0" wp14:editId="42C55119">
+            <wp:extent cx="6502400" cy="1159510"/>
+            <wp:effectExtent l="0" t="0" r="0" b="0"/>
+            <wp:docPr id="1461491426" name="Picture 2"/>
+            <wp:cNvGraphicFramePr>
+              <a:graphicFrameLocks xmlns:a="http://schemas.openxmlformats.org/drawingml/2006/main" noChangeAspect="1"/>
+            </wp:cNvGraphicFramePr>
+            <a:graphic xmlns:a="http://schemas.openxmlformats.org/drawingml/2006/main">
+              <a:graphicData uri="http://schemas.openxmlformats.org/drawingml/2006/picture">
+                <pic:pic xmlns:pic="http://schemas.openxmlformats.org/drawingml/2006/picture">
+                  <pic:nvPicPr>
+                    <pic:cNvPr id="1461491426" name="Picture 1461491426"/>
+                    <pic:cNvPicPr/>
+                  </pic:nvPicPr>
+                  <pic:blipFill>
+                    <a:blip r:embed="rId5" cstate="print">
+                      <a:extLst>
+                        <a:ext uri="{28A0092B-C50C-407E-A947-70E740481C1C}">
+                          <a14:useLocalDpi xmlns:a14="http://schemas.microsoft.com/office/drawing/2010/main" val="0"/>
+                        </a:ext>
+                      </a:extLst>
+                    </a:blip>
+                    <a:stretch>
+                      <a:fillRect/>
+                    </a:stretch>
+                  </pic:blipFill>
+                  <pic:spPr>
+                    <a:xfrm>
+                      <a:off x="0" y="0"/>
+                      <a:ext cx="6502400" cy="1159510"/>
+                    </a:xfrm>
+                    <a:prstGeom prst="rect">
+                      <a:avLst/>
+                    </a:prstGeom>
+                  </pic:spPr>
+                </pic:pic>
+              </a:graphicData>
+            </a:graphic>
+          </wp:inline>
+        </w:drawing>
+      </w:r>
+    </w:p>
+    <w:p>
+      <w:pPr>
+        <w:pStyle w:val="ListParagraph"/>
+        <w:numPr>
+          <w:ilvl w:val="0"/>
+          <w:numId w:val="2"/>
+        </w:numPr>
+      </w:pPr>
+      <w:r>
+        <w:t>Alexander Dittel Escoba</w:t>
+      </w:r>
+      <w:r>
+        <w:t>r</w:t>
+      </w:r>
+    </w:p>
+    <w:p>
+      <w:pPr>
+        <w:pStyle w:val="ListParagraph"/>
+        <w:ind w:left="720"/>
+      </w:pPr>
+      <w:r>
+        <w:t>Firma:</w:t>
+      </w:r>
+    </w:p>
+    <w:p>
+      <w:pPr>
+        <w:pStyle w:val="ListParagraph"/>
+        <w:ind w:left="720"/>
+      </w:pPr>
+    </w:p>
+    <w:p>
+      <w:r>
+        <w:rPr>
+          <w:noProof/>
+        </w:rPr>
+        <w:drawing>
+          <wp:inline distT="0" distB="0" distL="0" distR="0" wp14:anchorId="77169851" wp14:editId="3B94491A">
+            <wp:extent cx="6502400" cy="1210310"/>
+            <wp:effectExtent l="0" t="0" r="0" b="0"/>
+            <wp:docPr id="231683843" name="Picture 1"/>
+            <wp:cNvGraphicFramePr>
+              <a:graphicFrameLocks xmlns:a="http://schemas.openxmlformats.org/drawingml/2006/main" noChangeAspect="1"/>
+            </wp:cNvGraphicFramePr>
+            <a:graphic xmlns:a="http://schemas.openxmlformats.org/drawingml/2006/main">
+              <a:graphicData uri="http://schemas.openxmlformats.org/drawingml/2006/picture">
+                <pic:pic xmlns:pic="http://schemas.openxmlformats.org/drawingml/2006/picture">
+                  <pic:nvPicPr>
+                    <pic:cNvPr id="1047376315" name="Picture 1047376315"/>
+                    <pic:cNvPicPr/>
+                  </pic:nvPicPr>
+                  <pic:blipFill>
+                    <a:blip r:embed="rId6" cstate="print">
+                      <a:extLst>
+                        <a:ext uri="{28A0092B-C50C-407E-A947-70E740481C1C}">
+                          <a14:useLocalDpi xmlns:a14="http://schemas.microsoft.com/office/drawing/2010/main" val="0"/>
+                        </a:ext>
+                      </a:extLst>
+                    </a:blip>
+                    <a:stretch>
+                      <a:fillRect/>
+                    </a:stretch>
+                  </pic:blipFill>
+                  <pic:spPr>
+                    <a:xfrm>
+                      <a:off x="0" y="0"/>
+                      <a:ext cx="6502400" cy="1210310"/>
+                    </a:xfrm>
+                    <a:prstGeom prst="rect">
+                      <a:avLst/>
+                    </a:prstGeom>
+                  </pic:spPr>
+                </pic:pic>
+              </a:graphicData>
+            </a:graphic>
+          </wp:inline>
+        </w:drawing>
+      </w:r>
+    </w:p>
+    <w:p/>
+    <w:p>
+      <w:pPr>
+        <w:pStyle w:val="ListParagraph"/>
+        <w:numPr>
+          <w:ilvl w:val="0"/>
+          <w:numId w:val="2"/>
+        </w:numPr>
+        <w:spacing w:after="160"/>
+      </w:pPr>
+      <w:r>
+        <w:lastRenderedPageBreak/>
+        <w:t>A</w:t>
+      </w:r>
+      <w:r>
+        <w:t>slehy Claret Aguilar Perez</w:t>
+      </w:r>
+      <w:r>
+        <w:br/>
+        <w:t>Firma:</w:t>
+      </w:r>
+    </w:p>
+    <w:p>
+      <w:pPr>
+        <w:pStyle w:val="ListParagraph"/>
+        <w:spacing w:after="160"/>
+        <w:ind w:left="720"/>
+      </w:pPr>
+    </w:p>
+    <w:p>
+      <w:pPr>
+        <w:pStyle w:val="ListParagraph"/>
+        <w:spacing w:after="160"/>
+        <w:ind w:left="720"/>
+      </w:pPr>
+      <w:r>
+        <w:rPr>
+          <w:noProof/>
+        </w:rPr>
+        <w:drawing>
+          <wp:inline distT="0" distB="0" distL="0" distR="0" wp14:anchorId="785BCD0C" wp14:editId="056CD782">
+            <wp:extent cx="6502400" cy="1287780"/>
+            <wp:effectExtent l="0" t="0" r="0" b="0"/>
+            <wp:docPr id="155690787" name="Picture 3"/>
+            <wp:cNvGraphicFramePr>
+              <a:graphicFrameLocks xmlns:a="http://schemas.openxmlformats.org/drawingml/2006/main" noChangeAspect="1"/>
+            </wp:cNvGraphicFramePr>
+            <a:graphic xmlns:a="http://schemas.openxmlformats.org/drawingml/2006/main">
+              <a:graphicData uri="http://schemas.openxmlformats.org/drawingml/2006/picture">
+                <pic:pic xmlns:pic="http://schemas.openxmlformats.org/drawingml/2006/picture">
+                  <pic:nvPicPr>
+                    <pic:cNvPr id="155690787" name="Picture 155690787"/>
+                    <pic:cNvPicPr/>
+                  </pic:nvPicPr>
+                  <pic:blipFill>
+                    <a:blip r:embed="rId7" cstate="print">
+                      <a:extLst>
+                        <a:ext uri="{28A0092B-C50C-407E-A947-70E740481C1C}">
+                          <a14:useLocalDpi xmlns:a14="http://schemas.microsoft.com/office/drawing/2010/main" val="0"/>
+                        </a:ext>
+                      </a:extLst>
+                    </a:blip>
+                    <a:stretch>
+                      <a:fillRect/>
+                    </a:stretch>
+                  </pic:blipFill>
+                  <pic:spPr>
+                    <a:xfrm>
+                      <a:off x="0" y="0"/>
+                      <a:ext cx="6502400" cy="1287780"/>
+                    </a:xfrm>
+                    <a:prstGeom prst="rect">
+                      <a:avLst/>
+                    </a:prstGeom>
+                  </pic:spPr>
+                </pic:pic>
+              </a:graphicData>
+            </a:graphic>
+          </wp:inline>
+        </w:drawing>
+      </w:r>
+    </w:p>
+    <w:p>
+      <w:pPr>
         <w:spacing w:before="500"/>
       </w:pPr>
       <w:r>
-        <w:t>Fecha de firma: _____ / _____ / 2026</w:t>
+        <w:t xml:space="preserve">Fecha de firma: </w:t>
+      </w:r>
+      <w:r>
+        <w:t>3</w:t>
+      </w:r>
+      <w:r>
+        <w:t xml:space="preserve"> / </w:t>
+      </w:r>
+      <w:r>
+        <w:t>09</w:t>
+      </w:r>
+      <w:r>
+        <w:t xml:space="preserve"> / 2026</w:t>
       </w:r>
     </w:p>
     <w:sectPr>
@@ -2128,11 +2141,127 @@
       </w:pPr>
     </w:lvl>
   </w:abstractNum>
+  <w:abstractNum w:abstractNumId="1" w15:restartNumberingAfterBreak="0">
+    <w:nsid w:val="47D31FAD"/>
+    <w:multiLevelType w:val="hybridMultilevel"/>
+    <w:tmpl w:val="A9603F3A"/>
+    <w:lvl w:ilvl="0" w:tplc="471ED862">
+      <w:start w:val="5"/>
+      <w:numFmt w:val="bullet"/>
+      <w:lvlText w:val="-"/>
+      <w:lvlJc w:val="left"/>
+      <w:pPr>
+        <w:ind w:left="720" w:hanging="360"/>
+      </w:pPr>
+      <w:rPr>
+        <w:rFonts w:ascii="Times New Roman" w:eastAsia="Times New Roman" w:hAnsi="Times New Roman" w:cs="Times New Roman" w:hint="default"/>
+      </w:rPr>
+    </w:lvl>
+    <w:lvl w:ilvl="1" w:tplc="04090003" w:tentative="1">
+      <w:start w:val="1"/>
+      <w:numFmt w:val="bullet"/>
+      <w:lvlText w:val="o"/>
+      <w:lvlJc w:val="left"/>
+      <w:pPr>
+        <w:ind w:left="1440" w:hanging="360"/>
+      </w:pPr>
+      <w:rPr>
+        <w:rFonts w:ascii="Courier New" w:hAnsi="Courier New" w:hint="default"/>
+      </w:rPr>
+    </w:lvl>
+    <w:lvl w:ilvl="2" w:tplc="04090005" w:tentative="1">
+      <w:start w:val="1"/>
+      <w:numFmt w:val="bullet"/>
+      <w:lvlText w:val=""/>
+      <w:lvlJc w:val="left"/>
+      <w:pPr>
+        <w:ind w:left="2160" w:hanging="360"/>
+      </w:pPr>
+      <w:rPr>
+        <w:rFonts w:ascii="Wingdings" w:hAnsi="Wingdings" w:hint="default"/>
+      </w:rPr>
+    </w:lvl>
+    <w:lvl w:ilvl="3" w:tplc="04090001" w:tentative="1">
+      <w:start w:val="1"/>
+      <w:numFmt w:val="bullet"/>
+      <w:lvlText w:val=""/>
+      <w:lvlJc w:val="left"/>
+      <w:pPr>
+        <w:ind w:left="2880" w:hanging="360"/>
+      </w:pPr>
+      <w:rPr>
+        <w:rFonts w:ascii="Symbol" w:hAnsi="Symbol" w:hint="default"/>
+      </w:rPr>
+    </w:lvl>
+    <w:lvl w:ilvl="4" w:tplc="04090003" w:tentative="1">
+      <w:start w:val="1"/>
+      <w:numFmt w:val="bullet"/>
+      <w:lvlText w:val="o"/>
+      <w:lvlJc w:val="left"/>
+      <w:pPr>
+        <w:ind w:left="3600" w:hanging="360"/>
+      </w:pPr>
+      <w:rPr>
+        <w:rFonts w:ascii="Courier New" w:hAnsi="Courier New" w:hint="default"/>
+      </w:rPr>
+    </w:lvl>
+    <w:lvl w:ilvl="5" w:tplc="04090005" w:tentative="1">
+      <w:start w:val="1"/>
+      <w:numFmt w:val="bullet"/>
+      <w:lvlText w:val=""/>
+      <w:lvlJc w:val="left"/>
+      <w:pPr>
+        <w:ind w:left="4320" w:hanging="360"/>
+      </w:pPr>
+      <w:rPr>
+        <w:rFonts w:ascii="Wingdings" w:hAnsi="Wingdings" w:hint="default"/>
+      </w:rPr>
+    </w:lvl>
+    <w:lvl w:ilvl="6" w:tplc="04090001" w:tentative="1">
+      <w:start w:val="1"/>
+      <w:numFmt w:val="bullet"/>
+      <w:lvlText w:val=""/>
+      <w:lvlJc w:val="left"/>
+      <w:pPr>
+        <w:ind w:left="5040" w:hanging="360"/>
+      </w:pPr>
+      <w:rPr>
+        <w:rFonts w:ascii="Symbol" w:hAnsi="Symbol" w:hint="default"/>
+      </w:rPr>
+    </w:lvl>
+    <w:lvl w:ilvl="7" w:tplc="04090003" w:tentative="1">
+      <w:start w:val="1"/>
+      <w:numFmt w:val="bullet"/>
+      <w:lvlText w:val="o"/>
+      <w:lvlJc w:val="left"/>
+      <w:pPr>
+        <w:ind w:left="5760" w:hanging="360"/>
+      </w:pPr>
+      <w:rPr>
+        <w:rFonts w:ascii="Courier New" w:hAnsi="Courier New" w:hint="default"/>
+      </w:rPr>
+    </w:lvl>
+    <w:lvl w:ilvl="8" w:tplc="04090005" w:tentative="1">
+      <w:start w:val="1"/>
+      <w:numFmt w:val="bullet"/>
+      <w:lvlText w:val=""/>
+      <w:lvlJc w:val="left"/>
+      <w:pPr>
+        <w:ind w:left="6480" w:hanging="360"/>
+      </w:pPr>
+      <w:rPr>
+        <w:rFonts w:ascii="Wingdings" w:hAnsi="Wingdings" w:hint="default"/>
+      </w:rPr>
+    </w:lvl>
+  </w:abstractNum>
   <w:num w:numId="1" w16cid:durableId="149754134">
     <w:abstractNumId w:val="0"/>
     <w:lvlOverride w:ilvl="0">
       <w:startOverride w:val="1"/>
     </w:lvlOverride>
+  </w:num>
+  <w:num w:numId="2" w16cid:durableId="1713268656">
+    <w:abstractNumId w:val="1"/>
   </w:num>
 </w:numbering>
 </file>

</xml_diff>